<commit_message>
Update docs specifically with correct explicit https github URL
</commit_message>
<xml_diff>
--- a/report docs/GRC208-AWS-capstone-final-project-presentation.docx
+++ b/report docs/GRC208-AWS-capstone-final-project-presentation.docx
@@ -2,7 +2,7 @@
 <file path=word/document.xml><?xml version="1.0" encoding="utf-8"?>
 <w:document xmlns:w="http://schemas.openxmlformats.org/wordprocessingml/2006/main" xmlns:m="http://schemas.openxmlformats.org/officeDocument/2006/math" xmlns:r="http://schemas.openxmlformats.org/officeDocument/2006/relationships" xmlns:o="urn:schemas-microsoft-com:office:office" xmlns:v="urn:schemas-microsoft-com:vml" xmlns:w10="urn:schemas-microsoft-com:office:word" xmlns:a="http://schemas.openxmlformats.org/drawingml/2006/main" xmlns:pic="http://schemas.openxmlformats.org/drawingml/2006/picture" xmlns:wp="http://schemas.openxmlformats.org/drawingml/2006/wordprocessingDrawing">
   <w:body>
-    <w:bookmarkStart w:id="99" w:name="X01e877e731bd5faa3be1726b6672621503bc111"/>
+    <w:bookmarkStart w:id="102" w:name="X01e877e731bd5faa3be1726b6672621503bc111"/>
     <w:p>
       <w:pPr>
         <w:pStyle w:val="Heading1"/>
@@ -533,7 +533,7 @@
       </w:r>
     </w:p>
     <w:bookmarkEnd w:id="15"/>
-    <w:bookmarkStart w:id="16" w:name="Xe0999eb8bd54d27f61fd4d2c46a130ff2f79851"/>
+    <w:bookmarkStart w:id="19" w:name="Xe0999eb8bd54d27f61fd4d2c46a130ff2f79851"/>
     <w:p>
       <w:pPr>
         <w:pStyle w:val="Heading2"/>
@@ -660,7 +660,46 @@
         <w:br/>
       </w:r>
       <w:r>
-        <w:t xml:space="preserve">CloudFormation Infrastructure Stacks</w:t>
+        <w:drawing>
+          <wp:inline>
+            <wp:extent cx="5334000" cy="1534854"/>
+            <wp:effectExtent b="0" l="0" r="0" t="0"/>
+            <wp:docPr descr="CloudFormation Infrastructure Stacks" title="" id="17" name="Picture"/>
+            <a:graphic>
+              <a:graphicData uri="http://schemas.openxmlformats.org/drawingml/2006/picture">
+                <pic:pic>
+                  <pic:nvPicPr>
+                    <pic:cNvPr descr="media/Snapshots form GRC208-AWS/CloudFormation Infrastructure Stacks.JPG" id="18" name="Picture"/>
+                    <pic:cNvPicPr>
+                      <a:picLocks noChangeArrowheads="1" noChangeAspect="1"/>
+                    </pic:cNvPicPr>
+                  </pic:nvPicPr>
+                  <pic:blipFill>
+                    <a:blip r:embed="rId16"/>
+                    <a:stretch>
+                      <a:fillRect/>
+                    </a:stretch>
+                  </pic:blipFill>
+                  <pic:spPr bwMode="auto">
+                    <a:xfrm>
+                      <a:off x="0" y="0"/>
+                      <a:ext cx="5334000" cy="1534854"/>
+                    </a:xfrm>
+                    <a:prstGeom prst="rect">
+                      <a:avLst/>
+                    </a:prstGeom>
+                    <a:noFill/>
+                    <a:ln w="9525">
+                      <a:noFill/>
+                      <a:headEnd/>
+                      <a:tailEnd/>
+                    </a:ln>
+                  </pic:spPr>
+                </pic:pic>
+              </a:graphicData>
+            </a:graphic>
+          </wp:inline>
+        </w:drawing>
       </w:r>
     </w:p>
     <w:p>
@@ -692,8 +731,8 @@
         </w:pict>
       </w:r>
     </w:p>
-    <w:bookmarkEnd w:id="16"/>
-    <w:bookmarkStart w:id="20" w:name="X512e1b38ebbc9fc08a6c6585e67b0341cb93d60"/>
+    <w:bookmarkEnd w:id="19"/>
+    <w:bookmarkStart w:id="23" w:name="X512e1b38ebbc9fc08a6c6585e67b0341cb93d60"/>
     <w:p>
       <w:pPr>
         <w:pStyle w:val="Heading2"/>
@@ -817,18 +856,18 @@
           <wp:inline>
             <wp:extent cx="5334000" cy="1707964"/>
             <wp:effectExtent b="0" l="0" r="0" t="0"/>
-            <wp:docPr descr="DynamoDB Risk Register Table" title="" id="18" name="Picture"/>
+            <wp:docPr descr="DynamoDB Risk Register Table" title="" id="21" name="Picture"/>
             <a:graphic>
               <a:graphicData uri="http://schemas.openxmlformats.org/drawingml/2006/picture">
                 <pic:pic>
                   <pic:nvPicPr>
-                    <pic:cNvPr descr="media/Snapshots form GRC208-AWS/DynamoDB Risk Register Table.JPG" id="19" name="Picture"/>
+                    <pic:cNvPr descr="media/Snapshots form GRC208-AWS/DynamoDB Risk Register Table.JPG" id="22" name="Picture"/>
                     <pic:cNvPicPr>
                       <a:picLocks noChangeArrowheads="1" noChangeAspect="1"/>
                     </pic:cNvPicPr>
                   </pic:nvPicPr>
                   <pic:blipFill>
-                    <a:blip r:embed="rId17"/>
+                    <a:blip r:embed="rId20"/>
                     <a:stretch>
                       <a:fillRect/>
                     </a:stretch>
@@ -884,8 +923,8 @@
         </w:pict>
       </w:r>
     </w:p>
-    <w:bookmarkEnd w:id="20"/>
-    <w:bookmarkStart w:id="24" w:name="X8814eb871668ecd443cb28b6b005d64010c58ec"/>
+    <w:bookmarkEnd w:id="23"/>
+    <w:bookmarkStart w:id="27" w:name="X8814eb871668ecd443cb28b6b005d64010c58ec"/>
     <w:p>
       <w:pPr>
         <w:pStyle w:val="Heading2"/>
@@ -982,18 +1021,18 @@
           <wp:inline>
             <wp:extent cx="5334000" cy="1903304"/>
             <wp:effectExtent b="0" l="0" r="0" t="0"/>
-            <wp:docPr descr="Database Query Seeding Output" title="" id="22" name="Picture"/>
+            <wp:docPr descr="Database Query Seeding Output" title="" id="25" name="Picture"/>
             <a:graphic>
               <a:graphicData uri="http://schemas.openxmlformats.org/drawingml/2006/picture">
                 <pic:pic>
                   <pic:nvPicPr>
-                    <pic:cNvPr descr="media/Snapshots form GRC208-AWS/Database Query Seeding Output.JPG" id="23" name="Picture"/>
+                    <pic:cNvPr descr="media/Snapshots form GRC208-AWS/Database Query Seeding Output.JPG" id="26" name="Picture"/>
                     <pic:cNvPicPr>
                       <a:picLocks noChangeArrowheads="1" noChangeAspect="1"/>
                     </pic:cNvPicPr>
                   </pic:nvPicPr>
                   <pic:blipFill>
-                    <a:blip r:embed="rId21"/>
+                    <a:blip r:embed="rId24"/>
                     <a:stretch>
                       <a:fillRect/>
                     </a:stretch>
@@ -1049,8 +1088,8 @@
         </w:pict>
       </w:r>
     </w:p>
-    <w:bookmarkEnd w:id="24"/>
-    <w:bookmarkStart w:id="28" w:name="X310530641ed500b337f18f7c72e731b56d82e56"/>
+    <w:bookmarkEnd w:id="27"/>
+    <w:bookmarkStart w:id="31" w:name="X310530641ed500b337f18f7c72e731b56d82e56"/>
     <w:p>
       <w:pPr>
         <w:pStyle w:val="Heading2"/>
@@ -1177,18 +1216,18 @@
           <wp:inline>
             <wp:extent cx="5334000" cy="2108439"/>
             <wp:effectExtent b="0" l="0" r="0" t="0"/>
-            <wp:docPr descr="Lambda Function Execution Success" title="" id="26" name="Picture"/>
+            <wp:docPr descr="Lambda Function Execution Success" title="" id="29" name="Picture"/>
             <a:graphic>
               <a:graphicData uri="http://schemas.openxmlformats.org/drawingml/2006/picture">
                 <pic:pic>
                   <pic:nvPicPr>
-                    <pic:cNvPr descr="media/Snapshots form GRC208-AWS/Lambda Function Execution Success.JPG" id="27" name="Picture"/>
+                    <pic:cNvPr descr="media/Snapshots form GRC208-AWS/Lambda Function Execution Success.JPG" id="30" name="Picture"/>
                     <pic:cNvPicPr>
                       <a:picLocks noChangeArrowheads="1" noChangeAspect="1"/>
                     </pic:cNvPicPr>
                   </pic:nvPicPr>
                   <pic:blipFill>
-                    <a:blip r:embed="rId25"/>
+                    <a:blip r:embed="rId28"/>
                     <a:stretch>
                       <a:fillRect/>
                     </a:stretch>
@@ -1244,8 +1283,8 @@
         </w:pict>
       </w:r>
     </w:p>
-    <w:bookmarkEnd w:id="28"/>
-    <w:bookmarkStart w:id="32" w:name="Xf9f0cf61a9e9db0e5c0fd28fd73be7e0bab61f4"/>
+    <w:bookmarkEnd w:id="31"/>
+    <w:bookmarkStart w:id="35" w:name="Xf9f0cf61a9e9db0e5c0fd28fd73be7e0bab61f4"/>
     <w:p>
       <w:pPr>
         <w:pStyle w:val="Heading2"/>
@@ -1357,18 +1396,18 @@
           <wp:inline>
             <wp:extent cx="5334000" cy="1472704"/>
             <wp:effectExtent b="0" l="0" r="0" t="0"/>
-            <wp:docPr descr="EventBridge Hourly Schedule Rule" title="" id="30" name="Picture"/>
+            <wp:docPr descr="EventBridge Hourly Schedule Rule" title="" id="33" name="Picture"/>
             <a:graphic>
               <a:graphicData uri="http://schemas.openxmlformats.org/drawingml/2006/picture">
                 <pic:pic>
                   <pic:nvPicPr>
-                    <pic:cNvPr descr="media/Snapshots form GRC208-AWS/EventBridge Hourly Schedule Rule.JPG" id="31" name="Picture"/>
+                    <pic:cNvPr descr="media/Snapshots form GRC208-AWS/EventBridge Hourly Schedule Rule.JPG" id="34" name="Picture"/>
                     <pic:cNvPicPr>
                       <a:picLocks noChangeArrowheads="1" noChangeAspect="1"/>
                     </pic:cNvPicPr>
                   </pic:nvPicPr>
                   <pic:blipFill>
-                    <a:blip r:embed="rId29"/>
+                    <a:blip r:embed="rId32"/>
                     <a:stretch>
                       <a:fillRect/>
                     </a:stretch>
@@ -1436,8 +1475,8 @@
         </w:pict>
       </w:r>
     </w:p>
-    <w:bookmarkEnd w:id="32"/>
-    <w:bookmarkStart w:id="36" w:name="X3e3a923ac02051e2c1f07df463b27473cb517cd"/>
+    <w:bookmarkEnd w:id="35"/>
+    <w:bookmarkStart w:id="39" w:name="X3e3a923ac02051e2c1f07df463b27473cb517cd"/>
     <w:p>
       <w:pPr>
         <w:pStyle w:val="Heading2"/>
@@ -1537,18 +1576,18 @@
           <wp:inline>
             <wp:extent cx="5334000" cy="5216375"/>
             <wp:effectExtent b="0" l="0" r="0" t="0"/>
-            <wp:docPr descr="Automated Python Test Suite Success" title="" id="34" name="Picture"/>
+            <wp:docPr descr="Automated Python Test Suite Success" title="" id="37" name="Picture"/>
             <a:graphic>
               <a:graphicData uri="http://schemas.openxmlformats.org/drawingml/2006/picture">
                 <pic:pic>
                   <pic:nvPicPr>
-                    <pic:cNvPr descr="media/Snapshots form GRC208-AWS/Automated Python Test Suite Success.JPG" id="35" name="Picture"/>
+                    <pic:cNvPr descr="media/Snapshots form GRC208-AWS/Automated Python Test Suite Success.JPG" id="38" name="Picture"/>
                     <pic:cNvPicPr>
                       <a:picLocks noChangeArrowheads="1" noChangeAspect="1"/>
                     </pic:cNvPicPr>
                   </pic:nvPicPr>
                   <pic:blipFill>
-                    <a:blip r:embed="rId33"/>
+                    <a:blip r:embed="rId36"/>
                     <a:stretch>
                       <a:fillRect/>
                     </a:stretch>
@@ -1613,8 +1652,8 @@
         </w:pict>
       </w:r>
     </w:p>
-    <w:bookmarkEnd w:id="36"/>
-    <w:bookmarkStart w:id="40" w:name="Xaca1dc1a9b91c7d6748f5ab49eb2132295c81b2"/>
+    <w:bookmarkEnd w:id="39"/>
+    <w:bookmarkStart w:id="43" w:name="Xaca1dc1a9b91c7d6748f5ab49eb2132295c81b2"/>
     <w:p>
       <w:pPr>
         <w:pStyle w:val="Heading2"/>
@@ -1717,18 +1756,18 @@
           <wp:inline>
             <wp:extent cx="5334000" cy="1185333"/>
             <wp:effectExtent b="0" l="0" r="0" t="0"/>
-            <wp:docPr descr="Empty CloudFormation / Billing Budget" title="" id="38" name="Picture"/>
+            <wp:docPr descr="Empty CloudFormation / Billing Budget" title="" id="41" name="Picture"/>
             <a:graphic>
               <a:graphicData uri="http://schemas.openxmlformats.org/drawingml/2006/picture">
                 <pic:pic>
                   <pic:nvPicPr>
-                    <pic:cNvPr descr="media/Snapshots form GRC208-AWS/IAM Budget.JPG" id="39" name="Picture"/>
+                    <pic:cNvPr descr="media/Snapshots form GRC208-AWS/IAM Budget.JPG" id="42" name="Picture"/>
                     <pic:cNvPicPr>
                       <a:picLocks noChangeArrowheads="1" noChangeAspect="1"/>
                     </pic:cNvPicPr>
                   </pic:nvPicPr>
                   <pic:blipFill>
-                    <a:blip r:embed="rId37"/>
+                    <a:blip r:embed="rId40"/>
                     <a:stretch>
                       <a:fillRect/>
                     </a:stretch>
@@ -1784,8 +1823,8 @@
         </w:pict>
       </w:r>
     </w:p>
-    <w:bookmarkEnd w:id="40"/>
-    <w:bookmarkStart w:id="41" w:name="conclusion"/>
+    <w:bookmarkEnd w:id="43"/>
+    <w:bookmarkStart w:id="44" w:name="conclusion"/>
     <w:p>
       <w:pPr>
         <w:pStyle w:val="Heading2"/>
@@ -1901,8 +1940,8 @@
         </w:pict>
       </w:r>
     </w:p>
-    <w:bookmarkEnd w:id="41"/>
-    <w:bookmarkStart w:id="98" w:name="appendix-supplementary-project-evidence"/>
+    <w:bookmarkEnd w:id="44"/>
+    <w:bookmarkStart w:id="101" w:name="appendix-supplementary-project-evidence"/>
     <w:p>
       <w:pPr>
         <w:pStyle w:val="Heading2"/>
@@ -1931,7 +1970,7 @@
         <w:t xml:space="preserve">The following snapshots act as supplementary evidence corroborating the flawless deployment, orchestration, and teardown of the GRC capstone framework. They are included to ensure 100% technical traceability.</w:t>
       </w:r>
     </w:p>
-    <w:bookmarkStart w:id="45" w:name="verification-of-network-foundation"/>
+    <w:bookmarkStart w:id="48" w:name="verification-of-network-foundation"/>
     <w:p>
       <w:pPr>
         <w:pStyle w:val="Heading3"/>
@@ -1984,18 +2023,18 @@
           <wp:inline>
             <wp:extent cx="5334000" cy="837106"/>
             <wp:effectExtent b="0" l="0" r="0" t="0"/>
-            <wp:docPr descr="Check Network Stack" title="" id="43" name="Picture"/>
+            <wp:docPr descr="Check Network Stack" title="" id="46" name="Picture"/>
             <a:graphic>
               <a:graphicData uri="http://schemas.openxmlformats.org/drawingml/2006/picture">
                 <pic:pic>
                   <pic:nvPicPr>
-                    <pic:cNvPr descr="media/Snapshots form GRC208-AWS/Check Network Stack.JPG" id="44" name="Picture"/>
+                    <pic:cNvPr descr="media/Snapshots form GRC208-AWS/Check Network Stack.JPG" id="47" name="Picture"/>
                     <pic:cNvPicPr>
                       <a:picLocks noChangeArrowheads="1" noChangeAspect="1"/>
                     </pic:cNvPicPr>
                   </pic:nvPicPr>
                   <pic:blipFill>
-                    <a:blip r:embed="rId42"/>
+                    <a:blip r:embed="rId45"/>
                     <a:stretch>
                       <a:fillRect/>
                     </a:stretch>
@@ -2044,8 +2083,8 @@
         <w:t xml:space="preserve">“This confirms the foundational network architecture stack is active, highlighting the proper setup of the custom VPC, secure subnets, and routing required for the Capstone.”</w:t>
       </w:r>
     </w:p>
-    <w:bookmarkEnd w:id="45"/>
-    <w:bookmarkStart w:id="49" w:name="verification-of-database-backend"/>
+    <w:bookmarkEnd w:id="48"/>
+    <w:bookmarkStart w:id="52" w:name="verification-of-database-backend"/>
     <w:p>
       <w:pPr>
         <w:pStyle w:val="Heading3"/>
@@ -2098,18 +2137,18 @@
           <wp:inline>
             <wp:extent cx="5334000" cy="836806"/>
             <wp:effectExtent b="0" l="0" r="0" t="0"/>
-            <wp:docPr descr="Check Database Stack" title="" id="47" name="Picture"/>
+            <wp:docPr descr="Check Database Stack" title="" id="50" name="Picture"/>
             <a:graphic>
               <a:graphicData uri="http://schemas.openxmlformats.org/drawingml/2006/picture">
                 <pic:pic>
                   <pic:nvPicPr>
-                    <pic:cNvPr descr="media/Snapshots form GRC208-AWS/Check Database Stack.JPG" id="48" name="Picture"/>
+                    <pic:cNvPr descr="media/Snapshots form GRC208-AWS/Check Database Stack.JPG" id="51" name="Picture"/>
                     <pic:cNvPicPr>
                       <a:picLocks noChangeArrowheads="1" noChangeAspect="1"/>
                     </pic:cNvPicPr>
                   </pic:nvPicPr>
                   <pic:blipFill>
-                    <a:blip r:embed="rId46"/>
+                    <a:blip r:embed="rId49"/>
                     <a:stretch>
                       <a:fillRect/>
                     </a:stretch>
@@ -2158,8 +2197,8 @@
         <w:t xml:space="preserve">“A direct verification snapshot isolating the RDS database stack, proving that the secure backend storage is actively running and properly isolated from direct public interference.”</w:t>
       </w:r>
     </w:p>
-    <w:bookmarkEnd w:id="49"/>
-    <w:bookmarkStart w:id="53" w:name="global-infrastructure-status"/>
+    <w:bookmarkEnd w:id="52"/>
+    <w:bookmarkStart w:id="56" w:name="global-infrastructure-status"/>
     <w:p>
       <w:pPr>
         <w:pStyle w:val="Heading3"/>
@@ -2212,18 +2251,18 @@
           <wp:inline>
             <wp:extent cx="5334000" cy="1772876"/>
             <wp:effectExtent b="0" l="0" r="0" t="0"/>
-            <wp:docPr descr="Check ALL CloudFormation stack statuses" title="" id="51" name="Picture"/>
+            <wp:docPr descr="Check ALL CloudFormation stack statuses" title="" id="54" name="Picture"/>
             <a:graphic>
               <a:graphicData uri="http://schemas.openxmlformats.org/drawingml/2006/picture">
                 <pic:pic>
                   <pic:nvPicPr>
-                    <pic:cNvPr descr="media/Snapshots form GRC208-AWS/Check ALL CloudFormation stack statuses.JPG" id="52" name="Picture"/>
+                    <pic:cNvPr descr="media/Snapshots form GRC208-AWS/Check ALL CloudFormation stack statuses.JPG" id="55" name="Picture"/>
                     <pic:cNvPicPr>
                       <a:picLocks noChangeArrowheads="1" noChangeAspect="1"/>
                     </pic:cNvPicPr>
                   </pic:nvPicPr>
                   <pic:blipFill>
-                    <a:blip r:embed="rId50"/>
+                    <a:blip r:embed="rId53"/>
                     <a:stretch>
                       <a:fillRect/>
                     </a:stretch>
@@ -2272,8 +2311,8 @@
         <w:t xml:space="preserve">“This snapshot displays the AWS CLI verification checking the deployment status of all CloudFormation stacks simultaneously, confirming the successful overarching compilation of the environment.”</w:t>
       </w:r>
     </w:p>
-    <w:bookmarkEnd w:id="53"/>
-    <w:bookmarkStart w:id="57" w:name="secondary-database-seeding-verification"/>
+    <w:bookmarkEnd w:id="56"/>
+    <w:bookmarkStart w:id="60" w:name="secondary-database-seeding-verification"/>
     <w:p>
       <w:pPr>
         <w:pStyle w:val="Heading3"/>
@@ -2326,18 +2365,18 @@
           <wp:inline>
             <wp:extent cx="5334000" cy="1232353"/>
             <wp:effectExtent b="0" l="0" r="0" t="0"/>
-            <wp:docPr descr="Database Query Seeding Output-2" title="" id="55" name="Picture"/>
+            <wp:docPr descr="Database Query Seeding Output-2" title="" id="58" name="Picture"/>
             <a:graphic>
               <a:graphicData uri="http://schemas.openxmlformats.org/drawingml/2006/picture">
                 <pic:pic>
                   <pic:nvPicPr>
-                    <pic:cNvPr descr="media/Snapshots form GRC208-AWS/Database Query Seeding Output-2.JPG" id="56" name="Picture"/>
+                    <pic:cNvPr descr="media/Snapshots form GRC208-AWS/Database Query Seeding Output-2.JPG" id="59" name="Picture"/>
                     <pic:cNvPicPr>
                       <a:picLocks noChangeArrowheads="1" noChangeAspect="1"/>
                     </pic:cNvPicPr>
                   </pic:nvPicPr>
                   <pic:blipFill>
-                    <a:blip r:embed="rId54"/>
+                    <a:blip r:embed="rId57"/>
                     <a:stretch>
                       <a:fillRect/>
                     </a:stretch>
@@ -2386,8 +2425,8 @@
         <w:t xml:space="preserve">“Secondary proof of the RDS database seeding phase. This showcases additional successful SQL query returns executed against the compliance data backend to prove row insertion worked effectively.”</w:t>
       </w:r>
     </w:p>
-    <w:bookmarkEnd w:id="57"/>
-    <w:bookmarkStart w:id="61" w:name="secure-identity-posture"/>
+    <w:bookmarkEnd w:id="60"/>
+    <w:bookmarkStart w:id="64" w:name="secure-identity-posture"/>
     <w:p>
       <w:pPr>
         <w:pStyle w:val="Heading3"/>
@@ -2440,18 +2479,18 @@
           <wp:inline>
             <wp:extent cx="5334000" cy="3004286"/>
             <wp:effectExtent b="0" l="0" r="0" t="0"/>
-            <wp:docPr descr="MFA Setup Secure Account Foundation 2" title="" id="59" name="Picture"/>
+            <wp:docPr descr="MFA Setup Secure Account Foundation 2" title="" id="62" name="Picture"/>
             <a:graphic>
               <a:graphicData uri="http://schemas.openxmlformats.org/drawingml/2006/picture">
                 <pic:pic>
                   <pic:nvPicPr>
-                    <pic:cNvPr descr="media/Snapshots form GRC208-AWS/MFA Setup Secure Account Foundation 2.JPG" id="60" name="Picture"/>
+                    <pic:cNvPr descr="media/Snapshots form GRC208-AWS/MFA Setup Secure Account Foundation 2.JPG" id="63" name="Picture"/>
                     <pic:cNvPicPr>
                       <a:picLocks noChangeArrowheads="1" noChangeAspect="1"/>
                     </pic:cNvPicPr>
                   </pic:nvPicPr>
                   <pic:blipFill>
-                    <a:blip r:embed="rId58"/>
+                    <a:blip r:embed="rId61"/>
                     <a:stretch>
                       <a:fillRect/>
                     </a:stretch>
@@ -2500,8 +2539,8 @@
         <w:t xml:space="preserve">“Additional documentation proving the robustness of the IAM root account security posture through supplementary configuration of Multi-Factor Authentication (MFA).”</w:t>
       </w:r>
     </w:p>
-    <w:bookmarkEnd w:id="61"/>
-    <w:bookmarkStart w:id="65" w:name="cloudwatch-forensic-logging"/>
+    <w:bookmarkEnd w:id="64"/>
+    <w:bookmarkStart w:id="68" w:name="cloudwatch-forensic-logging"/>
     <w:p>
       <w:pPr>
         <w:pStyle w:val="Heading3"/>
@@ -2554,18 +2593,18 @@
           <wp:inline>
             <wp:extent cx="5334000" cy="3177341"/>
             <wp:effectExtent b="0" l="0" r="0" t="0"/>
-            <wp:docPr descr="CloudWatch Log mgmt (console)" title="" id="63" name="Picture"/>
+            <wp:docPr descr="CloudWatch Log mgmt (console)" title="" id="66" name="Picture"/>
             <a:graphic>
               <a:graphicData uri="http://schemas.openxmlformats.org/drawingml/2006/picture">
                 <pic:pic>
                   <pic:nvPicPr>
-                    <pic:cNvPr descr="media/Snapshots form GRC208-AWS/CloudWatch Log mgmt (console).JPG" id="64" name="Picture"/>
+                    <pic:cNvPr descr="media/Snapshots form GRC208-AWS/CloudWatch Log mgmt (console).JPG" id="67" name="Picture"/>
                     <pic:cNvPicPr>
                       <a:picLocks noChangeArrowheads="1" noChangeAspect="1"/>
                     </pic:cNvPicPr>
                   </pic:nvPicPr>
                   <pic:blipFill>
-                    <a:blip r:embed="rId62"/>
+                    <a:blip r:embed="rId65"/>
                     <a:stretch>
                       <a:fillRect/>
                     </a:stretch>
@@ -2614,8 +2653,8 @@
         <w:t xml:space="preserve">“This snapshot from the AWS Console highlights CloudWatch logging execution. In GRC principles, maintaining immutable logs of system executions is required for forensic auditing and incident response.”</w:t>
       </w:r>
     </w:p>
-    <w:bookmarkEnd w:id="65"/>
-    <w:bookmarkStart w:id="69" w:name="lambda-execution-role-verification"/>
+    <w:bookmarkEnd w:id="68"/>
+    <w:bookmarkStart w:id="72" w:name="lambda-execution-role-verification"/>
     <w:p>
       <w:pPr>
         <w:pStyle w:val="Heading3"/>
@@ -2668,18 +2707,18 @@
           <wp:inline>
             <wp:extent cx="5334000" cy="1580061"/>
             <wp:effectExtent b="0" l="0" r="0" t="0"/>
-            <wp:docPr descr="Check Lambda function" title="" id="67" name="Picture"/>
+            <wp:docPr descr="Check Lambda function" title="" id="70" name="Picture"/>
             <a:graphic>
               <a:graphicData uri="http://schemas.openxmlformats.org/drawingml/2006/picture">
                 <pic:pic>
                   <pic:nvPicPr>
-                    <pic:cNvPr descr="media/Snapshots form GRC208-AWS/Check Lambda function.JPG" id="68" name="Picture"/>
+                    <pic:cNvPr descr="media/Snapshots form GRC208-AWS/Check Lambda function.JPG" id="71" name="Picture"/>
                     <pic:cNvPicPr>
                       <a:picLocks noChangeArrowheads="1" noChangeAspect="1"/>
                     </pic:cNvPicPr>
                   </pic:nvPicPr>
                   <pic:blipFill>
-                    <a:blip r:embed="rId66"/>
+                    <a:blip r:embed="rId69"/>
                     <a:stretch>
                       <a:fillRect/>
                     </a:stretch>
@@ -2728,8 +2767,8 @@
         <w:t xml:space="preserve">“This captures the Lambda compliance monitor’s successful configuration profile. It verifies that the serverless function was accurately deployed alongside its necessary IAM execution roles.”</w:t>
       </w:r>
     </w:p>
-    <w:bookmarkEnd w:id="69"/>
-    <w:bookmarkStart w:id="73" w:name="graphical-lambda-execution-success"/>
+    <w:bookmarkEnd w:id="72"/>
+    <w:bookmarkStart w:id="76" w:name="graphical-lambda-execution-success"/>
     <w:p>
       <w:pPr>
         <w:pStyle w:val="Heading3"/>
@@ -2782,18 +2821,18 @@
           <wp:inline>
             <wp:extent cx="5334000" cy="1872373"/>
             <wp:effectExtent b="0" l="0" r="0" t="0"/>
-            <wp:docPr descr="Lambda Function Execution Success Console" title="" id="71" name="Picture"/>
+            <wp:docPr descr="Lambda Function Execution Success Console" title="" id="74" name="Picture"/>
             <a:graphic>
               <a:graphicData uri="http://schemas.openxmlformats.org/drawingml/2006/picture">
                 <pic:pic>
                   <pic:nvPicPr>
-                    <pic:cNvPr descr="media/Snapshots form GRC208-AWS/Lambda Function Execution Success Console.JPG" id="72" name="Picture"/>
+                    <pic:cNvPr descr="media/Snapshots form GRC208-AWS/Lambda Function Execution Success Console.JPG" id="75" name="Picture"/>
                     <pic:cNvPicPr>
                       <a:picLocks noChangeArrowheads="1" noChangeAspect="1"/>
                     </pic:cNvPicPr>
                   </pic:nvPicPr>
                   <pic:blipFill>
-                    <a:blip r:embed="rId70"/>
+                    <a:blip r:embed="rId73"/>
                     <a:stretch>
                       <a:fillRect/>
                     </a:stretch>
@@ -2842,8 +2881,8 @@
         <w:t xml:space="preserve">“Visual verification directly from the AWS Lambda Console, demonstrating the successful graphical execution logs of the testing component without runtime errors or memory timeouts.”</w:t>
       </w:r>
     </w:p>
-    <w:bookmarkEnd w:id="73"/>
-    <w:bookmarkStart w:id="77" w:name="config-recorder-initialisation"/>
+    <w:bookmarkEnd w:id="76"/>
+    <w:bookmarkStart w:id="80" w:name="config-recorder-initialisation"/>
     <w:p>
       <w:pPr>
         <w:pStyle w:val="Heading3"/>
@@ -2896,18 +2935,18 @@
           <wp:inline>
             <wp:extent cx="5334000" cy="785311"/>
             <wp:effectExtent b="0" l="0" r="0" t="0"/>
-            <wp:docPr descr="Check AWS Config recorder" title="" id="75" name="Picture"/>
+            <wp:docPr descr="Check AWS Config recorder" title="" id="78" name="Picture"/>
             <a:graphic>
               <a:graphicData uri="http://schemas.openxmlformats.org/drawingml/2006/picture">
                 <pic:pic>
                   <pic:nvPicPr>
-                    <pic:cNvPr descr="media/Snapshots form GRC208-AWS/Check AWS Config recorder.JPG" id="76" name="Picture"/>
+                    <pic:cNvPr descr="media/Snapshots form GRC208-AWS/Check AWS Config recorder.JPG" id="79" name="Picture"/>
                     <pic:cNvPicPr>
                       <a:picLocks noChangeArrowheads="1" noChangeAspect="1"/>
                     </pic:cNvPicPr>
                   </pic:nvPicPr>
                   <pic:blipFill>
-                    <a:blip r:embed="rId74"/>
+                    <a:blip r:embed="rId77"/>
                     <a:stretch>
                       <a:fillRect/>
                     </a:stretch>
@@ -2956,8 +2995,8 @@
         <w:t xml:space="preserve">“This snapshot acts as proof that the core AWS Config recorder was successfully enabled and configured to record infrastructure drift, which is pivotal for the automated compliance tracking engine.”</w:t>
       </w:r>
     </w:p>
-    <w:bookmarkEnd w:id="77"/>
-    <w:bookmarkStart w:id="81" w:name="centralized-evidence-storage"/>
+    <w:bookmarkEnd w:id="80"/>
+    <w:bookmarkStart w:id="84" w:name="centralized-evidence-storage"/>
     <w:p>
       <w:pPr>
         <w:pStyle w:val="Heading3"/>
@@ -3010,18 +3049,18 @@
           <wp:inline>
             <wp:extent cx="5334000" cy="2633754"/>
             <wp:effectExtent b="0" l="0" r="0" t="0"/>
-            <wp:docPr descr="S3 bucket" title="" id="79" name="Picture"/>
+            <wp:docPr descr="S3 bucket" title="" id="82" name="Picture"/>
             <a:graphic>
               <a:graphicData uri="http://schemas.openxmlformats.org/drawingml/2006/picture">
                 <pic:pic>
                   <pic:nvPicPr>
-                    <pic:cNvPr descr="media/Snapshots form GRC208-AWS/S3 bucket.JPG" id="80" name="Picture"/>
+                    <pic:cNvPr descr="media/Snapshots form GRC208-AWS/S3 bucket.JPG" id="83" name="Picture"/>
                     <pic:cNvPicPr>
                       <a:picLocks noChangeArrowheads="1" noChangeAspect="1"/>
                     </pic:cNvPicPr>
                   </pic:nvPicPr>
                   <pic:blipFill>
-                    <a:blip r:embed="rId78"/>
+                    <a:blip r:embed="rId81"/>
                     <a:stretch>
                       <a:fillRect/>
                     </a:stretch>
@@ -3070,8 +3109,8 @@
         <w:t xml:space="preserve">“A confirmation snapshot showing the successful deployment of the secure S3 bucket acting as the central storage repository for compliance evidence files and Config snapshots.”</w:t>
       </w:r>
     </w:p>
-    <w:bookmarkEnd w:id="81"/>
-    <w:bookmarkStart w:id="85" w:name="eventbridge-rule-configuration"/>
+    <w:bookmarkEnd w:id="84"/>
+    <w:bookmarkStart w:id="88" w:name="eventbridge-rule-configuration"/>
     <w:p>
       <w:pPr>
         <w:pStyle w:val="Heading3"/>
@@ -3124,18 +3163,18 @@
           <wp:inline>
             <wp:extent cx="5334000" cy="3394710"/>
             <wp:effectExtent b="0" l="0" r="0" t="0"/>
-            <wp:docPr descr="EventBridge Console" title="" id="83" name="Picture"/>
+            <wp:docPr descr="EventBridge Console" title="" id="86" name="Picture"/>
             <a:graphic>
               <a:graphicData uri="http://schemas.openxmlformats.org/drawingml/2006/picture">
                 <pic:pic>
                   <pic:nvPicPr>
-                    <pic:cNvPr descr="media/Snapshots form GRC208-AWS/EventBridge Console.JPG" id="84" name="Picture"/>
+                    <pic:cNvPr descr="media/Snapshots form GRC208-AWS/EventBridge Console.JPG" id="87" name="Picture"/>
                     <pic:cNvPicPr>
                       <a:picLocks noChangeArrowheads="1" noChangeAspect="1"/>
                     </pic:cNvPicPr>
                   </pic:nvPicPr>
                   <pic:blipFill>
-                    <a:blip r:embed="rId82"/>
+                    <a:blip r:embed="rId85"/>
                     <a:stretch>
                       <a:fillRect/>
                     </a:stretch>
@@ -3184,8 +3223,8 @@
         <w:t xml:space="preserve">“A view from the EventBridge Console dashboard providing raw visual evidence that the automation bus is structurally active and correctly interpreting scheduling metrics.”</w:t>
       </w:r>
     </w:p>
-    <w:bookmarkEnd w:id="85"/>
-    <w:bookmarkStart w:id="89" w:name="database-change-management-history"/>
+    <w:bookmarkEnd w:id="88"/>
+    <w:bookmarkStart w:id="92" w:name="database-change-management-history"/>
     <w:p>
       <w:pPr>
         <w:pStyle w:val="Heading3"/>
@@ -3238,18 +3277,18 @@
           <wp:inline>
             <wp:extent cx="5334000" cy="2259186"/>
             <wp:effectExtent b="0" l="0" r="0" t="0"/>
-            <wp:docPr descr="RDS Implementation History" title="" id="87" name="Picture"/>
+            <wp:docPr descr="RDS Implementation History" title="" id="90" name="Picture"/>
             <a:graphic>
               <a:graphicData uri="http://schemas.openxmlformats.org/drawingml/2006/picture">
                 <pic:pic>
                   <pic:nvPicPr>
-                    <pic:cNvPr descr="media/Snapshots form GRC208-AWS/RDS Implementation History.JPG" id="88" name="Picture"/>
+                    <pic:cNvPr descr="media/Snapshots form GRC208-AWS/RDS Implementation History.JPG" id="91" name="Picture"/>
                     <pic:cNvPicPr>
                       <a:picLocks noChangeArrowheads="1" noChangeAspect="1"/>
                     </pic:cNvPicPr>
                   </pic:nvPicPr>
                   <pic:blipFill>
-                    <a:blip r:embed="rId86"/>
+                    <a:blip r:embed="rId89"/>
                     <a:stretch>
                       <a:fillRect/>
                     </a:stretch>
@@ -3298,8 +3337,8 @@
         <w:t xml:space="preserve">“This snapshot captures the modification and lifecycle history of the RDS database, validating that proper change management controls were audited during the infrastructure’s deployment.”</w:t>
       </w:r>
     </w:p>
-    <w:bookmarkEnd w:id="89"/>
-    <w:bookmarkStart w:id="93" w:name="infrastructure-teardown-databases"/>
+    <w:bookmarkEnd w:id="92"/>
+    <w:bookmarkStart w:id="96" w:name="infrastructure-teardown-databases"/>
     <w:p>
       <w:pPr>
         <w:pStyle w:val="Heading3"/>
@@ -3352,18 +3391,18 @@
           <wp:inline>
             <wp:extent cx="5334000" cy="1373343"/>
             <wp:effectExtent b="0" l="0" r="0" t="0"/>
-            <wp:docPr descr="CloudFormation Database deletion" title="" id="91" name="Picture"/>
+            <wp:docPr descr="CloudFormation Database deletion" title="" id="94" name="Picture"/>
             <a:graphic>
               <a:graphicData uri="http://schemas.openxmlformats.org/drawingml/2006/picture">
                 <pic:pic>
                   <pic:nvPicPr>
-                    <pic:cNvPr descr="media/Snapshots form GRC208-AWS/CloudFormation Database deletion.JPG" id="92" name="Picture"/>
+                    <pic:cNvPr descr="media/Snapshots form GRC208-AWS/CloudFormation Database deletion.JPG" id="95" name="Picture"/>
                     <pic:cNvPicPr>
                       <a:picLocks noChangeArrowheads="1" noChangeAspect="1"/>
                     </pic:cNvPicPr>
                   </pic:nvPicPr>
                   <pic:blipFill>
-                    <a:blip r:embed="rId90"/>
+                    <a:blip r:embed="rId93"/>
                     <a:stretch>
                       <a:fillRect/>
                     </a:stretch>
@@ -3412,8 +3451,8 @@
         <w:t xml:space="preserve">“A critical piece of the project’s financial teardown methodology, capturing the automated dismantling of the RDS database stack to ensure secure data hygiene upon project completion.”</w:t>
       </w:r>
     </w:p>
-    <w:bookmarkEnd w:id="93"/>
-    <w:bookmarkStart w:id="97" w:name="infrastructure-teardown-networking"/>
+    <w:bookmarkEnd w:id="96"/>
+    <w:bookmarkStart w:id="100" w:name="infrastructure-teardown-networking"/>
     <w:p>
       <w:pPr>
         <w:pStyle w:val="Heading3"/>
@@ -3466,18 +3505,18 @@
           <wp:inline>
             <wp:extent cx="5334000" cy="1136921"/>
             <wp:effectExtent b="0" l="0" r="0" t="0"/>
-            <wp:docPr descr="CloudFormation Network Stack deletion" title="" id="95" name="Picture"/>
+            <wp:docPr descr="CloudFormation Network Stack deletion" title="" id="98" name="Picture"/>
             <a:graphic>
               <a:graphicData uri="http://schemas.openxmlformats.org/drawingml/2006/picture">
                 <pic:pic>
                   <pic:nvPicPr>
-                    <pic:cNvPr descr="media/Snapshots form GRC208-AWS/CloudFormation Network Stack deletion.JPG" id="96" name="Picture"/>
+                    <pic:cNvPr descr="media/Snapshots form GRC208-AWS/CloudFormation Network Stack deletion.JPG" id="99" name="Picture"/>
                     <pic:cNvPicPr>
                       <a:picLocks noChangeArrowheads="1" noChangeAspect="1"/>
                     </pic:cNvPicPr>
                   </pic:nvPicPr>
                   <pic:blipFill>
-                    <a:blip r:embed="rId94"/>
+                    <a:blip r:embed="rId97"/>
                     <a:stretch>
                       <a:fillRect/>
                     </a:stretch>
@@ -3526,9 +3565,9 @@
         <w:t xml:space="preserve">“A final snapshot demonstrating the overarching end-of-life process. This verifies the VPC and supporting network subnets were successfully deleted alongside the database to prevent lingering resource costs.”</w:t>
       </w:r>
     </w:p>
-    <w:bookmarkEnd w:id="97"/>
-    <w:bookmarkEnd w:id="98"/>
-    <w:bookmarkEnd w:id="99"/>
+    <w:bookmarkEnd w:id="100"/>
+    <w:bookmarkEnd w:id="101"/>
+    <w:bookmarkEnd w:id="102"/>
     <w:sectPr>
       <w:footnotePr>
         <w:numRestart w:val="eachSect"/>

</xml_diff>